<commit_message>
Updated format of reports
</commit_message>
<xml_diff>
--- a/LAB_3/Lab3_GabrielaBitca_FAF-242.docx
+++ b/LAB_3/Lab3_GabrielaBitca_FAF-242.docx
@@ -3069,10 +3069,7 @@
               <w:spacing w:line="276" w:lineRule="auto"/>
             </w:pPr>
             <w:r>
-              <w:rPr>
-                <w:highlight w:val="yellow"/>
-              </w:rPr>
-              <w:t>my prediction</w:t>
+              <w:t>error: no such file or directory for alfa and for beta.txt</w:t>
             </w:r>
           </w:p>
         </w:tc>
@@ -3497,10 +3494,7 @@
               <w:spacing w:line="276" w:lineRule="auto"/>
             </w:pPr>
             <w:r>
-              <w:rPr>
-                <w:highlight w:val="yellow"/>
-              </w:rPr>
-              <w:t>my prediction</w:t>
+              <w:t>log1.txt log2.txt log3.txt</w:t>
             </w:r>
           </w:p>
         </w:tc>

</xml_diff>